<commit_message>
Regenerate KPI_Reference.docx for the Revised 6 KPIs
Co-Authored-By: Claude Opus 4.8 (1M context) <noreply@anthropic.com>
</commit_message>
<xml_diff>
--- a/docs/client/KPI_Reference.docx
+++ b/docs/client/KPI_Reference.docx
@@ -7,7 +7,7 @@
         <w:pStyle w:val="Title"/>
       </w:pPr>
       <w:r>
-        <w:t>KPI Reference</w:t>
+        <w:t>KPI Reference (Revised)</w:t>
       </w:r>
     </w:p>
     <w:p>
@@ -16,7 +16,7 @@
           <w:i/>
           <w:sz w:val="22"/>
         </w:rPr>
-        <w:t>Data Monitoring Platform - how each headline KPI is defined and calculated</w:t>
+        <w:t>Data Monitoring Platform - the client-revised six KPIs: definitions, sources, formulas and thresholds</w:t>
       </w:r>
     </w:p>
     <w:p>
@@ -28,7 +28,7 @@
           <w:b w:val="0"/>
           <w:i w:val="0"/>
         </w:rPr>
-        <w:t>This reference describes the six standardized Page-1 KPIs, the survey questions each one draws on, the calculation method, and the traffic-light compliance thresholds. The KPI list, weights and thresholds are configurable live in the KPI Engine screen and are provisional pending final sign-off.</w:t>
+        <w:t>This reference reflects the REVISED KPI set. It describes each headline KPI, the survey questions it draws on (three channels: Field intercepts, Online BTR, Online Private Sale), the calculation method, and the traffic-light thresholds. All values are configurable live in the KPI Engine screen.</w:t>
       </w:r>
     </w:p>
     <w:p>
@@ -41,14 +41,10 @@
     </w:p>
     <w:p>
       <w:pPr>
-        <w:spacing w:after="80"/>
+        <w:spacing w:after="60"/>
       </w:pPr>
       <w:r>
-        <w:rPr>
-          <w:b w:val="0"/>
-          <w:i w:val="0"/>
-        </w:rPr>
-        <w:t>All KPIs share the same method so they are directly comparable on a 0-100 scale:</w:t>
+        <w:t>1. Scale questions are answered 1-5 and normalized to 0-100 via (raw - 1) / 4 x 100.</w:t>
       </w:r>
     </w:p>
     <w:p>
@@ -56,7 +52,7 @@
         <w:spacing w:after="60"/>
       </w:pPr>
       <w:r>
-        <w:t>1. Each contributing survey question is answered on a 1-5 scale.</w:t>
+        <w:t>2. Scored categorical questions map to fixed values: Energy settings Yes=100 / No=0; Field wellbeing awareness Yes_POS=100 / YES_NEG=50 / NO_NEG=0.</w:t>
       </w:r>
     </w:p>
     <w:p>
@@ -64,7 +60,7 @@
         <w:spacing w:after="60"/>
       </w:pPr>
       <w:r>
-        <w:t>2. Each answer is normalized to 0-100 using (raw - 1) / 4 x 100, so 1=0, 2=25, 3=50, 4=75, 5=100.</w:t>
+        <w:t>3. Single-input KPIs take the source's mean directly; composite KPIs combine source means by their weights.</w:t>
       </w:r>
     </w:p>
     <w:p>
@@ -72,7 +68,7 @@
         <w:spacing w:after="60"/>
       </w:pPr>
       <w:r>
-        <w:t>3. For each KPI, every source question is averaged across the responses currently in view, then the source averages are combined by their weights (a weighted average), or taken directly for single-input KPIs.</w:t>
+        <w:t>4. '50/50 by tenure' KPIs average the metric separately for BTR and Private Sale residents, then take the midpoint - each tenure counts equally regardless of response volume.</w:t>
       </w:r>
     </w:p>
     <w:p>
@@ -80,19 +76,7 @@
         <w:spacing w:after="60"/>
       </w:pPr>
       <w:r>
-        <w:t>4. The result is a 0-100 score; its compliance colour is set by the KPI's thresholds.</w:t>
-      </w:r>
-    </w:p>
-    <w:p>
-      <w:pPr>
-        <w:spacing w:after="80"/>
-      </w:pPr>
-      <w:r>
-        <w:rPr>
-          <w:b/>
-          <w:i w:val="0"/>
-        </w:rPr>
-        <w:t>Compliance bands:  score &gt;= Green threshold -&gt; GREEN (On track);  &gt;= Amber threshold -&gt; AMBER (Watch);  otherwise -&gt; RED (At risk).</w:t>
+        <w:t>5. The 0-100 result is coloured by the KPI's thresholds.</w:t>
       </w:r>
     </w:p>
     <w:p>
@@ -101,10 +85,10 @@
       </w:pPr>
       <w:r>
         <w:rPr>
-          <w:b w:val="0"/>
-          <w:i/>
+          <w:b/>
+          <w:i w:val="0"/>
         </w:rPr>
-        <w:t>Worked example - Public Realm Safety &amp; Accessibility. If the average normalized scores are Public Realm 70, Off-Peak Security 60, and Public Space 65, the KPI = 0.40x70 + 0.35x60 + 0.25x65 = 65.3, which is AMBER (Watch), because 45 &lt;= 65.3 &lt; 70.</w:t>
+        <w:t>Compliance bands:  score &gt;= Green -&gt; GREEN (On track);  &gt;= 40 -&gt; AMBER (Watch);  below 40 -&gt; RED (At risk).</w:t>
       </w:r>
     </w:p>
     <w:p>
@@ -147,7 +131,7 @@
         </w:tc>
         <w:tc>
           <w:tcPr>
-            <w:tcW w:type="dxa" w:w="2160"/>
+            <w:tcW w:type="dxa" w:w="2304"/>
           </w:tcPr>
           <w:p>
             <w:r/>
@@ -162,7 +146,7 @@
         </w:tc>
         <w:tc>
           <w:tcPr>
-            <w:tcW w:type="dxa" w:w="1440"/>
+            <w:tcW w:type="dxa" w:w="1728"/>
           </w:tcPr>
           <w:p>
             <w:r/>
@@ -177,7 +161,7 @@
         </w:tc>
         <w:tc>
           <w:tcPr>
-            <w:tcW w:type="dxa" w:w="3744"/>
+            <w:tcW w:type="dxa" w:w="3456"/>
           </w:tcPr>
           <w:p>
             <w:r/>
@@ -238,7 +222,7 @@
         </w:tc>
         <w:tc>
           <w:tcPr>
-            <w:tcW w:type="dxa" w:w="2160"/>
+            <w:tcW w:type="dxa" w:w="2304"/>
           </w:tcPr>
           <w:p>
             <w:r/>
@@ -246,13 +230,13 @@
               <w:rPr>
                 <w:sz w:val="19"/>
               </w:rPr>
-              <w:t>Local Health &amp; Environmental Quality</w:t>
+              <w:t>Environmental Quality</w:t>
             </w:r>
           </w:p>
         </w:tc>
         <w:tc>
           <w:tcPr>
-            <w:tcW w:type="dxa" w:w="1440"/>
+            <w:tcW w:type="dxa" w:w="1728"/>
           </w:tcPr>
           <w:p>
             <w:r/>
@@ -260,13 +244,13 @@
               <w:rPr>
                 <w:sz w:val="19"/>
               </w:rPr>
-              <w:t>Weighted average</w:t>
+              <w:t>Direct (single input)</w:t>
             </w:r>
           </w:p>
         </w:tc>
         <w:tc>
           <w:tcPr>
-            <w:tcW w:type="dxa" w:w="3744"/>
+            <w:tcW w:type="dxa" w:w="3456"/>
           </w:tcPr>
           <w:p>
             <w:r/>
@@ -274,7 +258,7 @@
               <w:rPr>
                 <w:sz w:val="19"/>
               </w:rPr>
-              <w:t>Green Infrastructure &amp; Efficiency (0.6), Community &amp; Wellbeing Awareness (0.4)</w:t>
+              <w:t>Field Q4 (1)</w:t>
             </w:r>
           </w:p>
         </w:tc>
@@ -302,7 +286,7 @@
               <w:rPr>
                 <w:sz w:val="19"/>
               </w:rPr>
-              <w:t>&gt;= 50</w:t>
+              <w:t>&gt;= 40</w:t>
             </w:r>
           </w:p>
         </w:tc>
@@ -324,7 +308,7 @@
         </w:tc>
         <w:tc>
           <w:tcPr>
-            <w:tcW w:type="dxa" w:w="2160"/>
+            <w:tcW w:type="dxa" w:w="2304"/>
           </w:tcPr>
           <w:p>
             <w:r/>
@@ -338,7 +322,7 @@
         </w:tc>
         <w:tc>
           <w:tcPr>
-            <w:tcW w:type="dxa" w:w="1440"/>
+            <w:tcW w:type="dxa" w:w="1728"/>
           </w:tcPr>
           <w:p>
             <w:r/>
@@ -352,7 +336,7 @@
         </w:tc>
         <w:tc>
           <w:tcPr>
-            <w:tcW w:type="dxa" w:w="3744"/>
+            <w:tcW w:type="dxa" w:w="3456"/>
           </w:tcPr>
           <w:p>
             <w:r/>
@@ -360,7 +344,7 @@
               <w:rPr>
                 <w:sz w:val="19"/>
               </w:rPr>
-              <w:t>Public Realm Contribution (0.4), Off-Peak Security (0.35), Public Space Sentiment (0.25)</w:t>
+              <w:t>Online Q7 (0.4), Online Q6 (0.35), Field Q4 (0.25)</w:t>
             </w:r>
           </w:p>
         </w:tc>
@@ -388,7 +372,7 @@
               <w:rPr>
                 <w:sz w:val="19"/>
               </w:rPr>
-              <w:t>&gt;= 45</w:t>
+              <w:t>&gt;= 40</w:t>
             </w:r>
           </w:p>
         </w:tc>
@@ -410,7 +394,7 @@
         </w:tc>
         <w:tc>
           <w:tcPr>
-            <w:tcW w:type="dxa" w:w="2160"/>
+            <w:tcW w:type="dxa" w:w="2304"/>
           </w:tcPr>
           <w:p>
             <w:r/>
@@ -418,13 +402,13 @@
               <w:rPr>
                 <w:sz w:val="19"/>
               </w:rPr>
-              <w:t>Sustainable Mobility Integration</w:t>
+              <w:t>Circularity &amp; Mobility Integration</w:t>
             </w:r>
           </w:p>
         </w:tc>
         <w:tc>
           <w:tcPr>
-            <w:tcW w:type="dxa" w:w="1440"/>
+            <w:tcW w:type="dxa" w:w="1728"/>
           </w:tcPr>
           <w:p>
             <w:r/>
@@ -438,7 +422,7 @@
         </w:tc>
         <w:tc>
           <w:tcPr>
-            <w:tcW w:type="dxa" w:w="3744"/>
+            <w:tcW w:type="dxa" w:w="3456"/>
           </w:tcPr>
           <w:p>
             <w:r/>
@@ -446,7 +430,7 @@
               <w:rPr>
                 <w:sz w:val="19"/>
               </w:rPr>
-              <w:t>Recycling &amp; Active Travel (1)</w:t>
+              <w:t>Online Q5 (1)</w:t>
             </w:r>
           </w:p>
         </w:tc>
@@ -474,7 +458,7 @@
               <w:rPr>
                 <w:sz w:val="19"/>
               </w:rPr>
-              <w:t>&gt;= 45</w:t>
+              <w:t>&gt;= 40</w:t>
             </w:r>
           </w:p>
         </w:tc>
@@ -496,7 +480,7 @@
         </w:tc>
         <w:tc>
           <w:tcPr>
-            <w:tcW w:type="dxa" w:w="2160"/>
+            <w:tcW w:type="dxa" w:w="2304"/>
           </w:tcPr>
           <w:p>
             <w:r/>
@@ -510,7 +494,7 @@
         </w:tc>
         <w:tc>
           <w:tcPr>
-            <w:tcW w:type="dxa" w:w="1440"/>
+            <w:tcW w:type="dxa" w:w="1728"/>
           </w:tcPr>
           <w:p>
             <w:r/>
@@ -518,13 +502,13 @@
               <w:rPr>
                 <w:sz w:val="19"/>
               </w:rPr>
-              <w:t>Weighted average</w:t>
+              <w:t>Direct, 50/50 by tenure</w:t>
             </w:r>
           </w:p>
         </w:tc>
         <w:tc>
           <w:tcPr>
-            <w:tcW w:type="dxa" w:w="3744"/>
+            <w:tcW w:type="dxa" w:w="3456"/>
           </w:tcPr>
           <w:p>
             <w:r/>
@@ -532,7 +516,7 @@
               <w:rPr>
                 <w:sz w:val="19"/>
               </w:rPr>
-              <w:t>Green Infrastructure &amp; Efficiency (0.7), Public Realm Contribution (0.3)</w:t>
+              <w:t>Online Q4 (1)</w:t>
             </w:r>
           </w:p>
         </w:tc>
@@ -546,7 +530,7 @@
               <w:rPr>
                 <w:sz w:val="19"/>
               </w:rPr>
-              <w:t>&gt;= 72</w:t>
+              <w:t>&gt;= 70</w:t>
             </w:r>
           </w:p>
         </w:tc>
@@ -560,7 +544,7 @@
               <w:rPr>
                 <w:sz w:val="19"/>
               </w:rPr>
-              <w:t>&gt;= 48</w:t>
+              <w:t>&gt;= 40</w:t>
             </w:r>
           </w:p>
         </w:tc>
@@ -582,7 +566,7 @@
         </w:tc>
         <w:tc>
           <w:tcPr>
-            <w:tcW w:type="dxa" w:w="2160"/>
+            <w:tcW w:type="dxa" w:w="2304"/>
           </w:tcPr>
           <w:p>
             <w:r/>
@@ -596,7 +580,7 @@
         </w:tc>
         <w:tc>
           <w:tcPr>
-            <w:tcW w:type="dxa" w:w="1440"/>
+            <w:tcW w:type="dxa" w:w="1728"/>
           </w:tcPr>
           <w:p>
             <w:r/>
@@ -610,7 +594,7 @@
         </w:tc>
         <w:tc>
           <w:tcPr>
-            <w:tcW w:type="dxa" w:w="3744"/>
+            <w:tcW w:type="dxa" w:w="3456"/>
           </w:tcPr>
           <w:p>
             <w:r/>
@@ -618,93 +602,7 @@
               <w:rPr>
                 <w:sz w:val="19"/>
               </w:rPr>
-              <w:t>Community &amp; Wellbeing Awareness (0.5), Management Responsiveness (0.5)</w:t>
-            </w:r>
-          </w:p>
-        </w:tc>
-        <w:tc>
-          <w:tcPr>
-            <w:tcW w:type="dxa" w:w="720"/>
-          </w:tcPr>
-          <w:p>
-            <w:r/>
-            <w:r>
-              <w:rPr>
-                <w:sz w:val="19"/>
-              </w:rPr>
-              <w:t>&gt;= 68</w:t>
-            </w:r>
-          </w:p>
-        </w:tc>
-        <w:tc>
-          <w:tcPr>
-            <w:tcW w:type="dxa" w:w="720"/>
-          </w:tcPr>
-          <w:p>
-            <w:r/>
-            <w:r>
-              <w:rPr>
-                <w:sz w:val="19"/>
-              </w:rPr>
-              <w:t>&gt;= 45</w:t>
-            </w:r>
-          </w:p>
-        </w:tc>
-      </w:tr>
-      <w:tr>
-        <w:tc>
-          <w:tcPr>
-            <w:tcW w:type="dxa" w:w="432"/>
-          </w:tcPr>
-          <w:p>
-            <w:r/>
-            <w:r>
-              <w:rPr>
-                <w:sz w:val="19"/>
-              </w:rPr>
-              <w:t>6</w:t>
-            </w:r>
-          </w:p>
-        </w:tc>
-        <w:tc>
-          <w:tcPr>
-            <w:tcW w:type="dxa" w:w="2160"/>
-          </w:tcPr>
-          <w:p>
-            <w:r/>
-            <w:r>
-              <w:rPr>
-                <w:sz w:val="19"/>
-              </w:rPr>
-              <w:t>Housing Affordability</w:t>
-            </w:r>
-          </w:p>
-        </w:tc>
-        <w:tc>
-          <w:tcPr>
-            <w:tcW w:type="dxa" w:w="1440"/>
-          </w:tcPr>
-          <w:p>
-            <w:r/>
-            <w:r>
-              <w:rPr>
-                <w:sz w:val="19"/>
-              </w:rPr>
-              <w:t>Direct (placeholder)</w:t>
-            </w:r>
-          </w:p>
-        </w:tc>
-        <w:tc>
-          <w:tcPr>
-            <w:tcW w:type="dxa" w:w="3744"/>
-          </w:tcPr>
-          <w:p>
-            <w:r/>
-            <w:r>
-              <w:rPr>
-                <w:sz w:val="19"/>
-              </w:rPr>
-              <w:t>Housing cost-to-income (external, placeholder) (1)</w:t>
+              <w:t>Field Q6 (0.5), Online Q9 (0.5)</w:t>
             </w:r>
           </w:p>
         </w:tc>
@@ -732,7 +630,93 @@
               <w:rPr>
                 <w:sz w:val="19"/>
               </w:rPr>
-              <w:t>&gt;= 45</w:t>
+              <w:t>&gt;= 40</w:t>
+            </w:r>
+          </w:p>
+        </w:tc>
+      </w:tr>
+      <w:tr>
+        <w:tc>
+          <w:tcPr>
+            <w:tcW w:type="dxa" w:w="432"/>
+          </w:tcPr>
+          <w:p>
+            <w:r/>
+            <w:r>
+              <w:rPr>
+                <w:sz w:val="19"/>
+              </w:rPr>
+              <w:t>6</w:t>
+            </w:r>
+          </w:p>
+        </w:tc>
+        <w:tc>
+          <w:tcPr>
+            <w:tcW w:type="dxa" w:w="2304"/>
+          </w:tcPr>
+          <w:p>
+            <w:r/>
+            <w:r>
+              <w:rPr>
+                <w:sz w:val="19"/>
+              </w:rPr>
+              <w:t>Operational Housing Affordability</w:t>
+            </w:r>
+          </w:p>
+        </w:tc>
+        <w:tc>
+          <w:tcPr>
+            <w:tcW w:type="dxa" w:w="1728"/>
+          </w:tcPr>
+          <w:p>
+            <w:r/>
+            <w:r>
+              <w:rPr>
+                <w:sz w:val="19"/>
+              </w:rPr>
+              <w:t>Direct, 50/50 by tenure</w:t>
+            </w:r>
+          </w:p>
+        </w:tc>
+        <w:tc>
+          <w:tcPr>
+            <w:tcW w:type="dxa" w:w="3456"/>
+          </w:tcPr>
+          <w:p>
+            <w:r/>
+            <w:r>
+              <w:rPr>
+                <w:sz w:val="19"/>
+              </w:rPr>
+              <w:t>Online Q3 (1)</w:t>
+            </w:r>
+          </w:p>
+        </w:tc>
+        <w:tc>
+          <w:tcPr>
+            <w:tcW w:type="dxa" w:w="720"/>
+          </w:tcPr>
+          <w:p>
+            <w:r/>
+            <w:r>
+              <w:rPr>
+                <w:sz w:val="19"/>
+              </w:rPr>
+              <w:t>&gt;= 65</w:t>
+            </w:r>
+          </w:p>
+        </w:tc>
+        <w:tc>
+          <w:tcPr>
+            <w:tcW w:type="dxa" w:w="720"/>
+          </w:tcPr>
+          <w:p>
+            <w:r/>
+            <w:r>
+              <w:rPr>
+                <w:sz w:val="19"/>
+              </w:rPr>
+              <w:t>&gt;= 40</w:t>
             </w:r>
           </w:p>
         </w:tc>
@@ -762,7 +746,7 @@
         <w:pStyle w:val="Heading2"/>
       </w:pPr>
       <w:r>
-        <w:t>1. Local Health &amp; Environmental Quality</w:t>
+        <w:t>1. Environmental Quality</w:t>
       </w:r>
     </w:p>
     <w:p>
@@ -774,7 +758,7 @@
           <w:b w:val="0"/>
           <w:i w:val="0"/>
         </w:rPr>
-        <w:t>Overall environmental and health quality of the development and its surroundings.</w:t>
+        <w:t>Dust, noise, air and mobility impact of the site, and efforts to make positive mitigation (plants, murals, etc.).</w:t>
       </w:r>
     </w:p>
     <w:p>
@@ -797,7 +781,7 @@
         <w:t xml:space="preserve">Method: </w:t>
       </w:r>
       <w:r>
-        <w:t xml:space="preserve">Weighted average      </w:t>
+        <w:t xml:space="preserve">Direct (single input)      </w:t>
       </w:r>
       <w:r>
         <w:rPr>
@@ -823,7 +807,7 @@
       <w:tr>
         <w:tc>
           <w:tcPr>
-            <w:tcW w:type="dxa" w:w="5184"/>
+            <w:tcW w:type="dxa" w:w="5760"/>
           </w:tcPr>
           <w:p>
             <w:r/>
@@ -838,7 +822,7 @@
         </w:tc>
         <w:tc>
           <w:tcPr>
-            <w:tcW w:type="dxa" w:w="1440"/>
+            <w:tcW w:type="dxa" w:w="1296"/>
           </w:tcPr>
           <w:p>
             <w:r/>
@@ -853,7 +837,7 @@
         </w:tc>
         <w:tc>
           <w:tcPr>
-            <w:tcW w:type="dxa" w:w="1152"/>
+            <w:tcW w:type="dxa" w:w="864"/>
           </w:tcPr>
           <w:p>
             <w:r/>
@@ -870,7 +854,7 @@
       <w:tr>
         <w:tc>
           <w:tcPr>
-            <w:tcW w:type="dxa" w:w="5184"/>
+            <w:tcW w:type="dxa" w:w="5760"/>
           </w:tcPr>
           <w:p>
             <w:r/>
@@ -878,13 +862,13 @@
               <w:rPr>
                 <w:sz w:val="19"/>
               </w:rPr>
-              <w:t>Green Infrastructure &amp; Efficiency</w:t>
+              <w:t>Field Q4 - local environmental quality &amp; physical impact</w:t>
             </w:r>
           </w:p>
         </w:tc>
         <w:tc>
           <w:tcPr>
-            <w:tcW w:type="dxa" w:w="1440"/>
+            <w:tcW w:type="dxa" w:w="1296"/>
           </w:tcPr>
           <w:p>
             <w:r/>
@@ -892,13 +876,13 @@
               <w:rPr>
                 <w:sz w:val="19"/>
               </w:rPr>
-              <w:t>Online</w:t>
+              <w:t>Field</w:t>
             </w:r>
           </w:p>
         </w:tc>
         <w:tc>
           <w:tcPr>
-            <w:tcW w:type="dxa" w:w="1152"/>
+            <w:tcW w:type="dxa" w:w="864"/>
           </w:tcPr>
           <w:p>
             <w:r/>
@@ -906,51 +890,7 @@
               <w:rPr>
                 <w:sz w:val="19"/>
               </w:rPr>
-              <w:t>0.6</w:t>
-            </w:r>
-          </w:p>
-        </w:tc>
-      </w:tr>
-      <w:tr>
-        <w:tc>
-          <w:tcPr>
-            <w:tcW w:type="dxa" w:w="5184"/>
-          </w:tcPr>
-          <w:p>
-            <w:r/>
-            <w:r>
-              <w:rPr>
-                <w:sz w:val="19"/>
-              </w:rPr>
-              <w:t>Community &amp; Wellbeing Awareness</w:t>
-            </w:r>
-          </w:p>
-        </w:tc>
-        <w:tc>
-          <w:tcPr>
-            <w:tcW w:type="dxa" w:w="1440"/>
-          </w:tcPr>
-          <w:p>
-            <w:r/>
-            <w:r>
-              <w:rPr>
-                <w:sz w:val="19"/>
-              </w:rPr>
-              <w:t>Online</w:t>
-            </w:r>
-          </w:p>
-        </w:tc>
-        <w:tc>
-          <w:tcPr>
-            <w:tcW w:type="dxa" w:w="1152"/>
-          </w:tcPr>
-          <w:p>
-            <w:r/>
-            <w:r>
-              <w:rPr>
-                <w:sz w:val="19"/>
-              </w:rPr>
-              <w:t>0.4</w:t>
+              <w:t>1</w:t>
             </w:r>
           </w:p>
         </w:tc>
@@ -970,7 +910,7 @@
         <w:rPr>
           <w:rFonts w:ascii="Consolas" w:hAnsi="Consolas"/>
         </w:rPr>
-        <w:t>(0.6 x GreenInfra + 0.4 x WellbeingAware)</w:t>
+        <w:t>FS_Q4 (normalized 0-100)</w:t>
       </w:r>
     </w:p>
     <w:p>
@@ -984,7 +924,7 @@
         <w:t xml:space="preserve">Thresholds: </w:t>
       </w:r>
       <w:r>
-        <w:t>Green (On track) &gt;= 75   |   Amber (Watch) &gt;= 50   |   Red (At risk) &lt; 50</w:t>
+        <w:t>Green (On track) &gt;= 75   |   Amber (Watch) &gt;= 40   |   Red (At risk) &lt; 40</w:t>
       </w:r>
     </w:p>
     <w:p>
@@ -1053,7 +993,7 @@
       <w:tr>
         <w:tc>
           <w:tcPr>
-            <w:tcW w:type="dxa" w:w="5184"/>
+            <w:tcW w:type="dxa" w:w="5760"/>
           </w:tcPr>
           <w:p>
             <w:r/>
@@ -1068,7 +1008,7 @@
         </w:tc>
         <w:tc>
           <w:tcPr>
-            <w:tcW w:type="dxa" w:w="1440"/>
+            <w:tcW w:type="dxa" w:w="1296"/>
           </w:tcPr>
           <w:p>
             <w:r/>
@@ -1083,7 +1023,7 @@
         </w:tc>
         <w:tc>
           <w:tcPr>
-            <w:tcW w:type="dxa" w:w="1152"/>
+            <w:tcW w:type="dxa" w:w="864"/>
           </w:tcPr>
           <w:p>
             <w:r/>
@@ -1100,7 +1040,7 @@
       <w:tr>
         <w:tc>
           <w:tcPr>
-            <w:tcW w:type="dxa" w:w="5184"/>
+            <w:tcW w:type="dxa" w:w="5760"/>
           </w:tcPr>
           <w:p>
             <w:r/>
@@ -1108,13 +1048,13 @@
               <w:rPr>
                 <w:sz w:val="19"/>
               </w:rPr>
-              <w:t>Public Realm Contribution</w:t>
+              <w:t>Online Q7 - Public Realm Contribution</w:t>
             </w:r>
           </w:p>
         </w:tc>
         <w:tc>
           <w:tcPr>
-            <w:tcW w:type="dxa" w:w="1440"/>
+            <w:tcW w:type="dxa" w:w="1296"/>
           </w:tcPr>
           <w:p>
             <w:r/>
@@ -1128,7 +1068,7 @@
         </w:tc>
         <w:tc>
           <w:tcPr>
-            <w:tcW w:type="dxa" w:w="1152"/>
+            <w:tcW w:type="dxa" w:w="864"/>
           </w:tcPr>
           <w:p>
             <w:r/>
@@ -1144,7 +1084,7 @@
       <w:tr>
         <w:tc>
           <w:tcPr>
-            <w:tcW w:type="dxa" w:w="5184"/>
+            <w:tcW w:type="dxa" w:w="5760"/>
           </w:tcPr>
           <w:p>
             <w:r/>
@@ -1152,13 +1092,13 @@
               <w:rPr>
                 <w:sz w:val="19"/>
               </w:rPr>
-              <w:t>Off-Peak Security</w:t>
+              <w:t>Online Q6 - Off-Peak Security</w:t>
             </w:r>
           </w:p>
         </w:tc>
         <w:tc>
           <w:tcPr>
-            <w:tcW w:type="dxa" w:w="1440"/>
+            <w:tcW w:type="dxa" w:w="1296"/>
           </w:tcPr>
           <w:p>
             <w:r/>
@@ -1172,7 +1112,7 @@
         </w:tc>
         <w:tc>
           <w:tcPr>
-            <w:tcW w:type="dxa" w:w="1152"/>
+            <w:tcW w:type="dxa" w:w="864"/>
           </w:tcPr>
           <w:p>
             <w:r/>
@@ -1188,7 +1128,7 @@
       <w:tr>
         <w:tc>
           <w:tcPr>
-            <w:tcW w:type="dxa" w:w="5184"/>
+            <w:tcW w:type="dxa" w:w="5760"/>
           </w:tcPr>
           <w:p>
             <w:r/>
@@ -1196,13 +1136,13 @@
               <w:rPr>
                 <w:sz w:val="19"/>
               </w:rPr>
-              <w:t>Public Space Sentiment</w:t>
+              <w:t>Field Q4 - Public Space Sentiment</w:t>
             </w:r>
           </w:p>
         </w:tc>
         <w:tc>
           <w:tcPr>
-            <w:tcW w:type="dxa" w:w="1440"/>
+            <w:tcW w:type="dxa" w:w="1296"/>
           </w:tcPr>
           <w:p>
             <w:r/>
@@ -1216,7 +1156,7 @@
         </w:tc>
         <w:tc>
           <w:tcPr>
-            <w:tcW w:type="dxa" w:w="1152"/>
+            <w:tcW w:type="dxa" w:w="864"/>
           </w:tcPr>
           <w:p>
             <w:r/>
@@ -1258,7 +1198,7 @@
         <w:t xml:space="preserve">Thresholds: </w:t>
       </w:r>
       <w:r>
-        <w:t>Green (On track) &gt;= 70   |   Amber (Watch) &gt;= 45   |   Red (At risk) &lt; 45</w:t>
+        <w:t>Green (On track) &gt;= 70   |   Amber (Watch) &gt;= 40   |   Red (At risk) &lt; 40</w:t>
       </w:r>
     </w:p>
     <w:p>
@@ -1266,7 +1206,7 @@
         <w:pStyle w:val="Heading2"/>
       </w:pPr>
       <w:r>
-        <w:t>3. Sustainable Mobility Integration</w:t>
+        <w:t>3. Circularity &amp; Mobility Integration</w:t>
       </w:r>
     </w:p>
     <w:p>
@@ -1278,7 +1218,7 @@
           <w:b w:val="0"/>
           <w:i w:val="0"/>
         </w:rPr>
-        <w:t>Ease and uptake of low-carbon travel - recycling and active-travel infrastructure.</w:t>
+        <w:t>Intuitiveness and uptake of the onsite recycling and active-travel infrastructure.</w:t>
       </w:r>
     </w:p>
     <w:p>
@@ -1327,7 +1267,7 @@
       <w:tr>
         <w:tc>
           <w:tcPr>
-            <w:tcW w:type="dxa" w:w="5184"/>
+            <w:tcW w:type="dxa" w:w="5760"/>
           </w:tcPr>
           <w:p>
             <w:r/>
@@ -1342,7 +1282,7 @@
         </w:tc>
         <w:tc>
           <w:tcPr>
-            <w:tcW w:type="dxa" w:w="1440"/>
+            <w:tcW w:type="dxa" w:w="1296"/>
           </w:tcPr>
           <w:p>
             <w:r/>
@@ -1357,7 +1297,7 @@
         </w:tc>
         <w:tc>
           <w:tcPr>
-            <w:tcW w:type="dxa" w:w="1152"/>
+            <w:tcW w:type="dxa" w:w="864"/>
           </w:tcPr>
           <w:p>
             <w:r/>
@@ -1374,7 +1314,7 @@
       <w:tr>
         <w:tc>
           <w:tcPr>
-            <w:tcW w:type="dxa" w:w="5184"/>
+            <w:tcW w:type="dxa" w:w="5760"/>
           </w:tcPr>
           <w:p>
             <w:r/>
@@ -1382,13 +1322,13 @@
               <w:rPr>
                 <w:sz w:val="19"/>
               </w:rPr>
-              <w:t>Recycling &amp; Active Travel</w:t>
+              <w:t>Online Q5 - Recycling &amp; Active Travel</w:t>
             </w:r>
           </w:p>
         </w:tc>
         <w:tc>
           <w:tcPr>
-            <w:tcW w:type="dxa" w:w="1440"/>
+            <w:tcW w:type="dxa" w:w="1296"/>
           </w:tcPr>
           <w:p>
             <w:r/>
@@ -1402,7 +1342,7 @@
         </w:tc>
         <w:tc>
           <w:tcPr>
-            <w:tcW w:type="dxa" w:w="1152"/>
+            <w:tcW w:type="dxa" w:w="864"/>
           </w:tcPr>
           <w:p>
             <w:r/>
@@ -1430,7 +1370,7 @@
         <w:rPr>
           <w:rFonts w:ascii="Consolas" w:hAnsi="Consolas"/>
         </w:rPr>
-        <w:t>ActiveTravel</w:t>
+        <w:t>OL_Q5 (normalized 0-100)</w:t>
       </w:r>
     </w:p>
     <w:p>
@@ -1444,7 +1384,7 @@
         <w:t xml:space="preserve">Thresholds: </w:t>
       </w:r>
       <w:r>
-        <w:t>Green (On track) &gt;= 70   |   Amber (Watch) &gt;= 45   |   Red (At risk) &lt; 45</w:t>
+        <w:t>Green (On track) &gt;= 70   |   Amber (Watch) &gt;= 40   |   Red (At risk) &lt; 40</w:t>
       </w:r>
     </w:p>
     <w:p>
@@ -1464,7 +1404,7 @@
           <w:b w:val="0"/>
           <w:i w:val="0"/>
         </w:rPr>
-        <w:t>Environmental efficiency and the development's contribution to a sustainable public realm.</w:t>
+        <w:t>Understanding of how to use the development's sustainability features (energy settings awareness).</w:t>
       </w:r>
     </w:p>
     <w:p>
@@ -1487,7 +1427,7 @@
         <w:t xml:space="preserve">Method: </w:t>
       </w:r>
       <w:r>
-        <w:t xml:space="preserve">Weighted average      </w:t>
+        <w:t xml:space="preserve">Direct, 50/50 by tenure      </w:t>
       </w:r>
       <w:r>
         <w:rPr>
@@ -1513,7 +1453,7 @@
       <w:tr>
         <w:tc>
           <w:tcPr>
-            <w:tcW w:type="dxa" w:w="5184"/>
+            <w:tcW w:type="dxa" w:w="5760"/>
           </w:tcPr>
           <w:p>
             <w:r/>
@@ -1528,7 +1468,7 @@
         </w:tc>
         <w:tc>
           <w:tcPr>
-            <w:tcW w:type="dxa" w:w="1440"/>
+            <w:tcW w:type="dxa" w:w="1296"/>
           </w:tcPr>
           <w:p>
             <w:r/>
@@ -1543,7 +1483,7 @@
         </w:tc>
         <w:tc>
           <w:tcPr>
-            <w:tcW w:type="dxa" w:w="1152"/>
+            <w:tcW w:type="dxa" w:w="864"/>
           </w:tcPr>
           <w:p>
             <w:r/>
@@ -1560,7 +1500,7 @@
       <w:tr>
         <w:tc>
           <w:tcPr>
-            <w:tcW w:type="dxa" w:w="5184"/>
+            <w:tcW w:type="dxa" w:w="5760"/>
           </w:tcPr>
           <w:p>
             <w:r/>
@@ -1568,13 +1508,13 @@
               <w:rPr>
                 <w:sz w:val="19"/>
               </w:rPr>
-              <w:t>Green Infrastructure &amp; Efficiency</w:t>
+              <w:t>Online Q4 - 'Do you know how to optimize your apartment's energy settings?' (Yes=100 / No=0)</w:t>
             </w:r>
           </w:p>
         </w:tc>
         <w:tc>
           <w:tcPr>
-            <w:tcW w:type="dxa" w:w="1440"/>
+            <w:tcW w:type="dxa" w:w="1296"/>
           </w:tcPr>
           <w:p>
             <w:r/>
@@ -1588,7 +1528,7 @@
         </w:tc>
         <w:tc>
           <w:tcPr>
-            <w:tcW w:type="dxa" w:w="1152"/>
+            <w:tcW w:type="dxa" w:w="864"/>
           </w:tcPr>
           <w:p>
             <w:r/>
@@ -1596,51 +1536,7 @@
               <w:rPr>
                 <w:sz w:val="19"/>
               </w:rPr>
-              <w:t>0.7</w:t>
-            </w:r>
-          </w:p>
-        </w:tc>
-      </w:tr>
-      <w:tr>
-        <w:tc>
-          <w:tcPr>
-            <w:tcW w:type="dxa" w:w="5184"/>
-          </w:tcPr>
-          <w:p>
-            <w:r/>
-            <w:r>
-              <w:rPr>
-                <w:sz w:val="19"/>
-              </w:rPr>
-              <w:t>Public Realm Contribution</w:t>
-            </w:r>
-          </w:p>
-        </w:tc>
-        <w:tc>
-          <w:tcPr>
-            <w:tcW w:type="dxa" w:w="1440"/>
-          </w:tcPr>
-          <w:p>
-            <w:r/>
-            <w:r>
-              <w:rPr>
-                <w:sz w:val="19"/>
-              </w:rPr>
-              <w:t>Online</w:t>
-            </w:r>
-          </w:p>
-        </w:tc>
-        <w:tc>
-          <w:tcPr>
-            <w:tcW w:type="dxa" w:w="1152"/>
-          </w:tcPr>
-          <w:p>
-            <w:r/>
-            <w:r>
-              <w:rPr>
-                <w:sz w:val="19"/>
-              </w:rPr>
-              <w:t>0.3</w:t>
+              <w:t>1</w:t>
             </w:r>
           </w:p>
         </w:tc>
@@ -1660,7 +1556,7 @@
         <w:rPr>
           <w:rFonts w:ascii="Consolas" w:hAnsi="Consolas"/>
         </w:rPr>
-        <w:t>(0.7 x GreenInfra + 0.3 x PublicRealm)</w:t>
+        <w:t>mean(Yes/No score) per tenure (BTR, Private Sale), then 50/50 average</w:t>
       </w:r>
     </w:p>
     <w:p>
@@ -1674,7 +1570,7 @@
         <w:t xml:space="preserve">Thresholds: </w:t>
       </w:r>
       <w:r>
-        <w:t>Green (On track) &gt;= 72   |   Amber (Watch) &gt;= 48   |   Red (At risk) &lt; 48</w:t>
+        <w:t>Green (On track) &gt;= 70   |   Amber (Watch) &gt;= 40   |   Red (At risk) &lt; 40</w:t>
       </w:r>
     </w:p>
     <w:p>
@@ -1694,7 +1590,7 @@
           <w:b w:val="0"/>
           <w:i w:val="0"/>
         </w:rPr>
-        <w:t>Sense of community and wellbeing, and confidence that management responds to residents.</w:t>
+        <w:t>Awareness of local community events, green space access and wellness initiatives (field + online).</w:t>
       </w:r>
     </w:p>
     <w:p>
@@ -1743,7 +1639,7 @@
       <w:tr>
         <w:tc>
           <w:tcPr>
-            <w:tcW w:type="dxa" w:w="5184"/>
+            <w:tcW w:type="dxa" w:w="5760"/>
           </w:tcPr>
           <w:p>
             <w:r/>
@@ -1758,7 +1654,7 @@
         </w:tc>
         <w:tc>
           <w:tcPr>
-            <w:tcW w:type="dxa" w:w="1440"/>
+            <w:tcW w:type="dxa" w:w="1296"/>
           </w:tcPr>
           <w:p>
             <w:r/>
@@ -1773,7 +1669,7 @@
         </w:tc>
         <w:tc>
           <w:tcPr>
-            <w:tcW w:type="dxa" w:w="1152"/>
+            <w:tcW w:type="dxa" w:w="864"/>
           </w:tcPr>
           <w:p>
             <w:r/>
@@ -1790,7 +1686,7 @@
       <w:tr>
         <w:tc>
           <w:tcPr>
-            <w:tcW w:type="dxa" w:w="5184"/>
+            <w:tcW w:type="dxa" w:w="5760"/>
           </w:tcPr>
           <w:p>
             <w:r/>
@@ -1798,13 +1694,13 @@
               <w:rPr>
                 <w:sz w:val="19"/>
               </w:rPr>
-              <w:t>Community &amp; Wellbeing Awareness</w:t>
+              <w:t>Field Q6 - Wellbeing/Offerings Awareness (Yes_POS=100 / YES_NEG=50 / NO_NEG=0)</w:t>
             </w:r>
           </w:p>
         </w:tc>
         <w:tc>
           <w:tcPr>
-            <w:tcW w:type="dxa" w:w="1440"/>
+            <w:tcW w:type="dxa" w:w="1296"/>
           </w:tcPr>
           <w:p>
             <w:r/>
@@ -1812,13 +1708,13 @@
               <w:rPr>
                 <w:sz w:val="19"/>
               </w:rPr>
-              <w:t>Online</w:t>
+              <w:t>Field</w:t>
             </w:r>
           </w:p>
         </w:tc>
         <w:tc>
           <w:tcPr>
-            <w:tcW w:type="dxa" w:w="1152"/>
+            <w:tcW w:type="dxa" w:w="864"/>
           </w:tcPr>
           <w:p>
             <w:r/>
@@ -1834,7 +1730,7 @@
       <w:tr>
         <w:tc>
           <w:tcPr>
-            <w:tcW w:type="dxa" w:w="5184"/>
+            <w:tcW w:type="dxa" w:w="5760"/>
           </w:tcPr>
           <w:p>
             <w:r/>
@@ -1842,13 +1738,13 @@
               <w:rPr>
                 <w:sz w:val="19"/>
               </w:rPr>
-              <w:t>Management Responsiveness</w:t>
+              <w:t>Online Q9 - Community &amp; Wellbeing Awareness</w:t>
             </w:r>
           </w:p>
         </w:tc>
         <w:tc>
           <w:tcPr>
-            <w:tcW w:type="dxa" w:w="1440"/>
+            <w:tcW w:type="dxa" w:w="1296"/>
           </w:tcPr>
           <w:p>
             <w:r/>
@@ -1862,7 +1758,7 @@
         </w:tc>
         <w:tc>
           <w:tcPr>
-            <w:tcW w:type="dxa" w:w="1152"/>
+            <w:tcW w:type="dxa" w:w="864"/>
           </w:tcPr>
           <w:p>
             <w:r/>
@@ -1890,7 +1786,7 @@
         <w:rPr>
           <w:rFonts w:ascii="Consolas" w:hAnsi="Consolas"/>
         </w:rPr>
-        <w:t>(0.5 x WellbeingAware + 0.5 x ManagementResponsiveness)</w:t>
+        <w:t>(0.5 x FieldAwareness + 0.5 x OnlineAwareness)</w:t>
       </w:r>
     </w:p>
     <w:p>
@@ -1904,7 +1800,7 @@
         <w:t xml:space="preserve">Thresholds: </w:t>
       </w:r>
       <w:r>
-        <w:t>Green (On track) &gt;= 68   |   Amber (Watch) &gt;= 45   |   Red (At risk) &lt; 45</w:t>
+        <w:t>Green (On track) &gt;= 65   |   Amber (Watch) &gt;= 40   |   Red (At risk) &lt; 40</w:t>
       </w:r>
     </w:p>
     <w:p>
@@ -1912,7 +1808,7 @@
         <w:pStyle w:val="Heading2"/>
       </w:pPr>
       <w:r>
-        <w:t>6. Housing Affordability</w:t>
+        <w:t>6. Operational Housing Affordability</w:t>
       </w:r>
     </w:p>
     <w:p>
@@ -1924,7 +1820,7 @@
           <w:b w:val="0"/>
           <w:i w:val="0"/>
         </w:rPr>
-        <w:t>Housing cost-to-income affordability. No survey question captures this yet - currently a placeholder pending an external housing-data feed.</w:t>
+        <w:t>Agreement with: 'I believe that the costs associated with living in this development are manageable and sustainable.' Low scores (1-3) trigger the Q3B open-text follow-up.</w:t>
       </w:r>
     </w:p>
     <w:p>
@@ -1947,7 +1843,7 @@
         <w:t xml:space="preserve">Method: </w:t>
       </w:r>
       <w:r>
-        <w:t xml:space="preserve">Direct (placeholder)      </w:t>
+        <w:t xml:space="preserve">Direct, 50/50 by tenure      </w:t>
       </w:r>
       <w:r>
         <w:rPr>
@@ -1973,7 +1869,7 @@
       <w:tr>
         <w:tc>
           <w:tcPr>
-            <w:tcW w:type="dxa" w:w="5184"/>
+            <w:tcW w:type="dxa" w:w="5760"/>
           </w:tcPr>
           <w:p>
             <w:r/>
@@ -1988,7 +1884,7 @@
         </w:tc>
         <w:tc>
           <w:tcPr>
-            <w:tcW w:type="dxa" w:w="1440"/>
+            <w:tcW w:type="dxa" w:w="1296"/>
           </w:tcPr>
           <w:p>
             <w:r/>
@@ -2003,7 +1899,7 @@
         </w:tc>
         <w:tc>
           <w:tcPr>
-            <w:tcW w:type="dxa" w:w="1152"/>
+            <w:tcW w:type="dxa" w:w="864"/>
           </w:tcPr>
           <w:p>
             <w:r/>
@@ -2020,7 +1916,7 @@
       <w:tr>
         <w:tc>
           <w:tcPr>
-            <w:tcW w:type="dxa" w:w="5184"/>
+            <w:tcW w:type="dxa" w:w="5760"/>
           </w:tcPr>
           <w:p>
             <w:r/>
@@ -2028,13 +1924,13 @@
               <w:rPr>
                 <w:sz w:val="19"/>
               </w:rPr>
-              <w:t>Housing cost-to-income (external, placeholder)</w:t>
+              <w:t>Online Q3 - Cost Manageability (agreement 1-5)</w:t>
             </w:r>
           </w:p>
         </w:tc>
         <w:tc>
           <w:tcPr>
-            <w:tcW w:type="dxa" w:w="1440"/>
+            <w:tcW w:type="dxa" w:w="1296"/>
           </w:tcPr>
           <w:p>
             <w:r/>
@@ -2042,13 +1938,13 @@
               <w:rPr>
                 <w:sz w:val="19"/>
               </w:rPr>
-              <w:t>-</w:t>
+              <w:t>Online</w:t>
             </w:r>
           </w:p>
         </w:tc>
         <w:tc>
           <w:tcPr>
-            <w:tcW w:type="dxa" w:w="1152"/>
+            <w:tcW w:type="dxa" w:w="864"/>
           </w:tcPr>
           <w:p>
             <w:r/>
@@ -2076,7 +1972,7 @@
         <w:rPr>
           <w:rFonts w:ascii="Consolas" w:hAnsi="Consolas"/>
         </w:rPr>
-        <w:t>100 - normalize(cost-to-income ratio)</w:t>
+        <w:t>mean(Q3 normalized) per tenure (BTR, Private Sale), then 50/50 average</w:t>
       </w:r>
     </w:p>
     <w:p>
@@ -2090,7 +1986,7 @@
         <w:t xml:space="preserve">Thresholds: </w:t>
       </w:r>
       <w:r>
-        <w:t>Green (On track) &gt;= 65   |   Amber (Watch) &gt;= 45   |   Red (At risk) &lt; 45</w:t>
+        <w:t>Green (On track) &gt;= 65   |   Amber (Watch) &gt;= 40   |   Red (At risk) &lt; 40</w:t>
       </w:r>
     </w:p>
     <w:p>
@@ -2099,18 +1995,6 @@
       </w:pPr>
       <w:r>
         <w:t>4. Survey questions used</w:t>
-      </w:r>
-    </w:p>
-    <w:p>
-      <w:pPr>
-        <w:spacing w:after="80"/>
-      </w:pPr>
-      <w:r>
-        <w:rPr>
-          <w:b w:val="0"/>
-          <w:i w:val="0"/>
-        </w:rPr>
-        <w:t>The impact questions that feed the KPIs (all answered 1-5 and normalized to 0-100):</w:t>
       </w:r>
     </w:p>
     <w:tbl>
@@ -2129,7 +2013,7 @@
       <w:tr>
         <w:tc>
           <w:tcPr>
-            <w:tcW w:type="dxa" w:w="2304"/>
+            <w:tcW w:type="dxa" w:w="2160"/>
           </w:tcPr>
           <w:p>
             <w:r/>
@@ -2159,7 +2043,7 @@
         </w:tc>
         <w:tc>
           <w:tcPr>
-            <w:tcW w:type="dxa" w:w="1152"/>
+            <w:tcW w:type="dxa" w:w="1584"/>
           </w:tcPr>
           <w:p>
             <w:r/>
@@ -2174,7 +2058,7 @@
         </w:tc>
         <w:tc>
           <w:tcPr>
-            <w:tcW w:type="dxa" w:w="864"/>
+            <w:tcW w:type="dxa" w:w="2016"/>
           </w:tcPr>
           <w:p>
             <w:r/>
@@ -2183,13 +2067,13 @@
                 <w:b/>
                 <w:sz w:val="19"/>
               </w:rPr>
-              <w:t>Scale</w:t>
+              <w:t>Scale / scoring</w:t>
             </w:r>
           </w:p>
         </w:tc>
         <w:tc>
           <w:tcPr>
-            <w:tcW w:type="dxa" w:w="1440"/>
+            <w:tcW w:type="dxa" w:w="1152"/>
           </w:tcPr>
           <w:p>
             <w:r/>
@@ -2206,7 +2090,7 @@
       <w:tr>
         <w:tc>
           <w:tcPr>
-            <w:tcW w:type="dxa" w:w="2304"/>
+            <w:tcW w:type="dxa" w:w="2160"/>
           </w:tcPr>
           <w:p>
             <w:r/>
@@ -2228,13 +2112,13 @@
               <w:rPr>
                 <w:sz w:val="19"/>
               </w:rPr>
-              <w:t>Public Space Sentiment</w:t>
+              <w:t>Field Q4 - Environmental quality / public space sentiment</w:t>
             </w:r>
           </w:p>
         </w:tc>
         <w:tc>
           <w:tcPr>
-            <w:tcW w:type="dxa" w:w="1152"/>
+            <w:tcW w:type="dxa" w:w="1584"/>
           </w:tcPr>
           <w:p>
             <w:r/>
@@ -2248,7 +2132,7 @@
         </w:tc>
         <w:tc>
           <w:tcPr>
-            <w:tcW w:type="dxa" w:w="864"/>
+            <w:tcW w:type="dxa" w:w="2016"/>
           </w:tcPr>
           <w:p>
             <w:r/>
@@ -2262,7 +2146,7 @@
         </w:tc>
         <w:tc>
           <w:tcPr>
-            <w:tcW w:type="dxa" w:w="1440"/>
+            <w:tcW w:type="dxa" w:w="1152"/>
           </w:tcPr>
           <w:p>
             <w:r/>
@@ -2278,7 +2162,7 @@
       <w:tr>
         <w:tc>
           <w:tcPr>
-            <w:tcW w:type="dxa" w:w="2304"/>
+            <w:tcW w:type="dxa" w:w="2160"/>
           </w:tcPr>
           <w:p>
             <w:r/>
@@ -2286,7 +2170,7 @@
               <w:rPr>
                 <w:sz w:val="19"/>
               </w:rPr>
-              <w:t>OL_GREEN_INFRA</w:t>
+              <w:t>FS_WELLBEING_AWARE</w:t>
             </w:r>
           </w:p>
         </w:tc>
@@ -2300,7 +2184,35 @@
               <w:rPr>
                 <w:sz w:val="19"/>
               </w:rPr>
-              <w:t>Green Infrastructure &amp; Efficiency</w:t>
+              <w:t>Field Q6 - Wellbeing/offerings awareness</w:t>
+            </w:r>
+          </w:p>
+        </w:tc>
+        <w:tc>
+          <w:tcPr>
+            <w:tcW w:type="dxa" w:w="1584"/>
+          </w:tcPr>
+          <w:p>
+            <w:r/>
+            <w:r>
+              <w:rPr>
+                <w:sz w:val="19"/>
+              </w:rPr>
+              <w:t>Field</w:t>
+            </w:r>
+          </w:p>
+        </w:tc>
+        <w:tc>
+          <w:tcPr>
+            <w:tcW w:type="dxa" w:w="2016"/>
+          </w:tcPr>
+          <w:p>
+            <w:r/>
+            <w:r>
+              <w:rPr>
+                <w:sz w:val="19"/>
+              </w:rPr>
+              <w:t>Yes_POS / YES_NEG / NO_NEG (scored 100/50/0)</w:t>
             </w:r>
           </w:p>
         </w:tc>
@@ -2314,13 +2226,57 @@
               <w:rPr>
                 <w:sz w:val="19"/>
               </w:rPr>
-              <w:t>Online</w:t>
+              <w:t>GRESB TC 6.1</w:t>
+            </w:r>
+          </w:p>
+        </w:tc>
+      </w:tr>
+      <w:tr>
+        <w:tc>
+          <w:tcPr>
+            <w:tcW w:type="dxa" w:w="2160"/>
+          </w:tcPr>
+          <w:p>
+            <w:r/>
+            <w:r>
+              <w:rPr>
+                <w:sz w:val="19"/>
+              </w:rPr>
+              <w:t>OL_COST_MANAGEABLE</w:t>
             </w:r>
           </w:p>
         </w:tc>
         <w:tc>
           <w:tcPr>
-            <w:tcW w:type="dxa" w:w="864"/>
+            <w:tcW w:type="dxa" w:w="3888"/>
+          </w:tcPr>
+          <w:p>
+            <w:r/>
+            <w:r>
+              <w:rPr>
+                <w:sz w:val="19"/>
+              </w:rPr>
+              <w:t>Online Q3 - Living costs manageable &amp; sustainable</w:t>
+            </w:r>
+          </w:p>
+        </w:tc>
+        <w:tc>
+          <w:tcPr>
+            <w:tcW w:type="dxa" w:w="1584"/>
+          </w:tcPr>
+          <w:p>
+            <w:r/>
+            <w:r>
+              <w:rPr>
+                <w:sz w:val="19"/>
+              </w:rPr>
+              <w:t>Online (BTR + Private Sale)</w:t>
+            </w:r>
+          </w:p>
+        </w:tc>
+        <w:tc>
+          <w:tcPr>
+            <w:tcW w:type="dxa" w:w="2016"/>
           </w:tcPr>
           <w:p>
             <w:r/>
@@ -2334,7 +2290,7 @@
         </w:tc>
         <w:tc>
           <w:tcPr>
-            <w:tcW w:type="dxa" w:w="1440"/>
+            <w:tcW w:type="dxa" w:w="1152"/>
           </w:tcPr>
           <w:p>
             <w:r/>
@@ -2350,7 +2306,151 @@
       <w:tr>
         <w:tc>
           <w:tcPr>
-            <w:tcW w:type="dxa" w:w="2304"/>
+            <w:tcW w:type="dxa" w:w="2160"/>
+          </w:tcPr>
+          <w:p>
+            <w:r/>
+            <w:r>
+              <w:rPr>
+                <w:sz w:val="19"/>
+              </w:rPr>
+              <w:t>OL_COST_FOLLOWUP</w:t>
+            </w:r>
+          </w:p>
+        </w:tc>
+        <w:tc>
+          <w:tcPr>
+            <w:tcW w:type="dxa" w:w="3888"/>
+          </w:tcPr>
+          <w:p>
+            <w:r/>
+            <w:r>
+              <w:rPr>
+                <w:sz w:val="19"/>
+              </w:rPr>
+              <w:t>Online Q3B - open-text follow-up when Q3 is 1-3</w:t>
+            </w:r>
+          </w:p>
+        </w:tc>
+        <w:tc>
+          <w:tcPr>
+            <w:tcW w:type="dxa" w:w="1584"/>
+          </w:tcPr>
+          <w:p>
+            <w:r/>
+            <w:r>
+              <w:rPr>
+                <w:sz w:val="19"/>
+              </w:rPr>
+              <w:t>Online</w:t>
+            </w:r>
+          </w:p>
+        </w:tc>
+        <w:tc>
+          <w:tcPr>
+            <w:tcW w:type="dxa" w:w="2016"/>
+          </w:tcPr>
+          <w:p>
+            <w:r/>
+            <w:r>
+              <w:rPr>
+                <w:sz w:val="19"/>
+              </w:rPr>
+              <w:t>text</w:t>
+            </w:r>
+          </w:p>
+        </w:tc>
+        <w:tc>
+          <w:tcPr>
+            <w:tcW w:type="dxa" w:w="1152"/>
+          </w:tcPr>
+          <w:p>
+            <w:r/>
+            <w:r>
+              <w:rPr>
+                <w:sz w:val="19"/>
+              </w:rPr>
+              <w:t>-</w:t>
+            </w:r>
+          </w:p>
+        </w:tc>
+      </w:tr>
+      <w:tr>
+        <w:tc>
+          <w:tcPr>
+            <w:tcW w:type="dxa" w:w="2160"/>
+          </w:tcPr>
+          <w:p>
+            <w:r/>
+            <w:r>
+              <w:rPr>
+                <w:sz w:val="19"/>
+              </w:rPr>
+              <w:t>OL_ENERGY_KNOW</w:t>
+            </w:r>
+          </w:p>
+        </w:tc>
+        <w:tc>
+          <w:tcPr>
+            <w:tcW w:type="dxa" w:w="3888"/>
+          </w:tcPr>
+          <w:p>
+            <w:r/>
+            <w:r>
+              <w:rPr>
+                <w:sz w:val="19"/>
+              </w:rPr>
+              <w:t>Online Q4 - Knows how to optimize energy settings</w:t>
+            </w:r>
+          </w:p>
+        </w:tc>
+        <w:tc>
+          <w:tcPr>
+            <w:tcW w:type="dxa" w:w="1584"/>
+          </w:tcPr>
+          <w:p>
+            <w:r/>
+            <w:r>
+              <w:rPr>
+                <w:sz w:val="19"/>
+              </w:rPr>
+              <w:t>Online</w:t>
+            </w:r>
+          </w:p>
+        </w:tc>
+        <w:tc>
+          <w:tcPr>
+            <w:tcW w:type="dxa" w:w="2016"/>
+          </w:tcPr>
+          <w:p>
+            <w:r/>
+            <w:r>
+              <w:rPr>
+                <w:sz w:val="19"/>
+              </w:rPr>
+              <w:t>Yes / No (scored 100/0)</w:t>
+            </w:r>
+          </w:p>
+        </w:tc>
+        <w:tc>
+          <w:tcPr>
+            <w:tcW w:type="dxa" w:w="1152"/>
+          </w:tcPr>
+          <w:p>
+            <w:r/>
+            <w:r>
+              <w:rPr>
+                <w:sz w:val="19"/>
+              </w:rPr>
+              <w:t>-</w:t>
+            </w:r>
+          </w:p>
+        </w:tc>
+      </w:tr>
+      <w:tr>
+        <w:tc>
+          <w:tcPr>
+            <w:tcW w:type="dxa" w:w="2160"/>
           </w:tcPr>
           <w:p>
             <w:r/>
@@ -2372,13 +2472,13 @@
               <w:rPr>
                 <w:sz w:val="19"/>
               </w:rPr>
-              <w:t>Recycling &amp; Active Travel</w:t>
+              <w:t>Online Q5 - Recycling &amp; active travel</w:t>
             </w:r>
           </w:p>
         </w:tc>
         <w:tc>
           <w:tcPr>
-            <w:tcW w:type="dxa" w:w="1152"/>
+            <w:tcW w:type="dxa" w:w="1584"/>
           </w:tcPr>
           <w:p>
             <w:r/>
@@ -2392,7 +2492,7 @@
         </w:tc>
         <w:tc>
           <w:tcPr>
-            <w:tcW w:type="dxa" w:w="864"/>
+            <w:tcW w:type="dxa" w:w="2016"/>
           </w:tcPr>
           <w:p>
             <w:r/>
@@ -2406,7 +2506,7 @@
         </w:tc>
         <w:tc>
           <w:tcPr>
-            <w:tcW w:type="dxa" w:w="1440"/>
+            <w:tcW w:type="dxa" w:w="1152"/>
           </w:tcPr>
           <w:p>
             <w:r/>
@@ -2422,7 +2522,7 @@
       <w:tr>
         <w:tc>
           <w:tcPr>
-            <w:tcW w:type="dxa" w:w="2304"/>
+            <w:tcW w:type="dxa" w:w="2160"/>
           </w:tcPr>
           <w:p>
             <w:r/>
@@ -2444,13 +2544,13 @@
               <w:rPr>
                 <w:sz w:val="19"/>
               </w:rPr>
-              <w:t>Off-Peak Security</w:t>
+              <w:t>Online Q6 - Off-peak security</w:t>
             </w:r>
           </w:p>
         </w:tc>
         <w:tc>
           <w:tcPr>
-            <w:tcW w:type="dxa" w:w="1152"/>
+            <w:tcW w:type="dxa" w:w="1584"/>
           </w:tcPr>
           <w:p>
             <w:r/>
@@ -2464,7 +2564,7 @@
         </w:tc>
         <w:tc>
           <w:tcPr>
-            <w:tcW w:type="dxa" w:w="864"/>
+            <w:tcW w:type="dxa" w:w="2016"/>
           </w:tcPr>
           <w:p>
             <w:r/>
@@ -2478,7 +2578,7 @@
         </w:tc>
         <w:tc>
           <w:tcPr>
-            <w:tcW w:type="dxa" w:w="1440"/>
+            <w:tcW w:type="dxa" w:w="1152"/>
           </w:tcPr>
           <w:p>
             <w:r/>
@@ -2494,7 +2594,7 @@
       <w:tr>
         <w:tc>
           <w:tcPr>
-            <w:tcW w:type="dxa" w:w="2304"/>
+            <w:tcW w:type="dxa" w:w="2160"/>
           </w:tcPr>
           <w:p>
             <w:r/>
@@ -2516,13 +2616,13 @@
               <w:rPr>
                 <w:sz w:val="19"/>
               </w:rPr>
-              <w:t>Public Realm Contribution</w:t>
+              <w:t>Online Q7 - Public realm contribution</w:t>
             </w:r>
           </w:p>
         </w:tc>
         <w:tc>
           <w:tcPr>
-            <w:tcW w:type="dxa" w:w="1152"/>
+            <w:tcW w:type="dxa" w:w="1584"/>
           </w:tcPr>
           <w:p>
             <w:r/>
@@ -2536,7 +2636,7 @@
         </w:tc>
         <w:tc>
           <w:tcPr>
-            <w:tcW w:type="dxa" w:w="864"/>
+            <w:tcW w:type="dxa" w:w="2016"/>
           </w:tcPr>
           <w:p>
             <w:r/>
@@ -2550,7 +2650,7 @@
         </w:tc>
         <w:tc>
           <w:tcPr>
-            <w:tcW w:type="dxa" w:w="1440"/>
+            <w:tcW w:type="dxa" w:w="1152"/>
           </w:tcPr>
           <w:p>
             <w:r/>
@@ -2566,79 +2666,7 @@
       <w:tr>
         <w:tc>
           <w:tcPr>
-            <w:tcW w:type="dxa" w:w="2304"/>
-          </w:tcPr>
-          <w:p>
-            <w:r/>
-            <w:r>
-              <w:rPr>
-                <w:sz w:val="19"/>
-              </w:rPr>
-              <w:t>OL_GRIEVANCE</w:t>
-            </w:r>
-          </w:p>
-        </w:tc>
-        <w:tc>
-          <w:tcPr>
-            <w:tcW w:type="dxa" w:w="3888"/>
-          </w:tcPr>
-          <w:p>
-            <w:r/>
-            <w:r>
-              <w:rPr>
-                <w:sz w:val="19"/>
-              </w:rPr>
-              <w:t>Management Responsiveness</w:t>
-            </w:r>
-          </w:p>
-        </w:tc>
-        <w:tc>
-          <w:tcPr>
-            <w:tcW w:type="dxa" w:w="1152"/>
-          </w:tcPr>
-          <w:p>
-            <w:r/>
-            <w:r>
-              <w:rPr>
-                <w:sz w:val="19"/>
-              </w:rPr>
-              <w:t>Online</w:t>
-            </w:r>
-          </w:p>
-        </w:tc>
-        <w:tc>
-          <w:tcPr>
-            <w:tcW w:type="dxa" w:w="864"/>
-          </w:tcPr>
-          <w:p>
-            <w:r/>
-            <w:r>
-              <w:rPr>
-                <w:sz w:val="19"/>
-              </w:rPr>
-              <w:t>1-5</w:t>
-            </w:r>
-          </w:p>
-        </w:tc>
-        <w:tc>
-          <w:tcPr>
-            <w:tcW w:type="dxa" w:w="1440"/>
-          </w:tcPr>
-          <w:p>
-            <w:r/>
-            <w:r>
-              <w:rPr>
-                <w:sz w:val="19"/>
-              </w:rPr>
-              <w:t>-</w:t>
-            </w:r>
-          </w:p>
-        </w:tc>
-      </w:tr>
-      <w:tr>
-        <w:tc>
-          <w:tcPr>
-            <w:tcW w:type="dxa" w:w="2304"/>
+            <w:tcW w:type="dxa" w:w="2160"/>
           </w:tcPr>
           <w:p>
             <w:r/>
@@ -2660,13 +2688,13 @@
               <w:rPr>
                 <w:sz w:val="19"/>
               </w:rPr>
-              <w:t>Community &amp; Wellbeing Awareness</w:t>
+              <w:t>Online Q9 - Community &amp; wellbeing awareness</w:t>
             </w:r>
           </w:p>
         </w:tc>
         <w:tc>
           <w:tcPr>
-            <w:tcW w:type="dxa" w:w="1152"/>
+            <w:tcW w:type="dxa" w:w="1584"/>
           </w:tcPr>
           <w:p>
             <w:r/>
@@ -2680,7 +2708,7 @@
         </w:tc>
         <w:tc>
           <w:tcPr>
-            <w:tcW w:type="dxa" w:w="864"/>
+            <w:tcW w:type="dxa" w:w="2016"/>
           </w:tcPr>
           <w:p>
             <w:r/>
@@ -2694,79 +2722,7 @@
         </w:tc>
         <w:tc>
           <w:tcPr>
-            <w:tcW w:type="dxa" w:w="1440"/>
-          </w:tcPr>
-          <w:p>
-            <w:r/>
-            <w:r>
-              <w:rPr>
-                <w:sz w:val="19"/>
-              </w:rPr>
-              <w:t>-</w:t>
-            </w:r>
-          </w:p>
-        </w:tc>
-      </w:tr>
-      <w:tr>
-        <w:tc>
-          <w:tcPr>
-            <w:tcW w:type="dxa" w:w="2304"/>
-          </w:tcPr>
-          <w:p>
-            <w:r/>
-            <w:r>
-              <w:rPr>
-                <w:sz w:val="19"/>
-              </w:rPr>
-              <w:t>housing_cost_to_income</w:t>
-            </w:r>
-          </w:p>
-        </w:tc>
-        <w:tc>
-          <w:tcPr>
-            <w:tcW w:type="dxa" w:w="3888"/>
-          </w:tcPr>
-          <w:p>
-            <w:r/>
-            <w:r>
-              <w:rPr>
-                <w:sz w:val="19"/>
-              </w:rPr>
-              <w:t>Housing cost-to-income (external, placeholder)</w:t>
-            </w:r>
-          </w:p>
-        </w:tc>
-        <w:tc>
-          <w:tcPr>
             <w:tcW w:type="dxa" w:w="1152"/>
-          </w:tcPr>
-          <w:p>
-            <w:r/>
-            <w:r>
-              <w:rPr>
-                <w:sz w:val="19"/>
-              </w:rPr>
-              <w:t>-</w:t>
-            </w:r>
-          </w:p>
-        </w:tc>
-        <w:tc>
-          <w:tcPr>
-            <w:tcW w:type="dxa" w:w="864"/>
-          </w:tcPr>
-          <w:p>
-            <w:r/>
-            <w:r>
-              <w:rPr>
-                <w:sz w:val="19"/>
-              </w:rPr>
-              <w:t>%</w:t>
-            </w:r>
-          </w:p>
-        </w:tc>
-        <w:tc>
-          <w:tcPr>
-            <w:tcW w:type="dxa" w:w="1440"/>
           </w:tcPr>
           <w:p>
             <w:r/>
@@ -2794,7 +2750,7 @@
         <w:spacing w:after="60"/>
       </w:pPr>
       <w:r>
-        <w:t>The KPI list, source weights and thresholds are provisional and can be changed live in the KPI Engine screen (no code changes).</w:t>
+        <w:t>Thresholds are the revised set: green varies per KPI; amber is a uniform 40 floor.</w:t>
       </w:r>
     </w:p>
     <w:p>
@@ -2803,7 +2759,7 @@
         <w:spacing w:after="60"/>
       </w:pPr>
       <w:r>
-        <w:t>Housing Affordability is a placeholder: no survey question captures cost-to-income, so it currently runs on synthesized data pending an external housing-data feed.</w:t>
+        <w:t>Housing Affordability is now survey-backed (Online Q3) - the earlier cost-to-income placeholder is retired.</w:t>
       </w:r>
     </w:p>
     <w:p>
@@ -2812,7 +2768,7 @@
         <w:spacing w:after="60"/>
       </w:pPr>
       <w:r>
-        <w:t>Categorical questions (accessibility cohort, local proximity, top-2 offerings, energy awareness) are captured and stored, but are currently descriptive-only and do not feed the KPI scores.</w:t>
+        <w:t>The Online survey runs identically for BTR and Private Sale residents (two sheets / QR codes); 'by tenure' KPIs weight the two cohorts 50/50.</w:t>
       </w:r>
     </w:p>
     <w:p>
@@ -2821,7 +2777,25 @@
         <w:spacing w:after="60"/>
       </w:pPr>
       <w:r>
-        <w:t>Surveys run on a quarterly cadence; trends and history are bucketed by quarter (Q1-Q4).</w:t>
+        <w:t>The previous 'Green Infrastructure &amp; Efficiency' question was removed from the survey and is retired from the catalogue.</w:t>
+      </w:r>
+    </w:p>
+    <w:p>
+      <w:pPr>
+        <w:pStyle w:val="ListBullet"/>
+        <w:spacing w:after="60"/>
+      </w:pPr>
+      <w:r>
+        <w:t>Field Q4 feeds two KPIs: directly as Environmental Quality, and at 0.25 weight inside Public Realm Safety &amp; Accessibility.</w:t>
+      </w:r>
+    </w:p>
+    <w:p>
+      <w:pPr>
+        <w:pStyle w:val="ListBullet"/>
+        <w:spacing w:after="60"/>
+      </w:pPr>
+      <w:r>
+        <w:t>All weights and thresholds remain editable live in the KPI Engine screen.</w:t>
       </w:r>
     </w:p>
     <w:sectPr>

</xml_diff>